<commit_message>
Add AI lifecycle traceability, live dashboard metrics, and enhanced validation package generation
</commit_message>
<xml_diff>
--- a/Commissioning_Protocol.docx
+++ b/Commissioning_Protocol.docx
@@ -213,7 +213,7 @@
           </w:tcPr>
           <w:p>
             <w:r>
-              <w:t>2026-06-27</w:t>
+              <w:t>2026-07-03</w:t>
             </w:r>
           </w:p>
         </w:tc>
@@ -264,7 +264,7 @@
     </w:p>
     <w:p>
       <w:r>
-        <w:t>Date: 2026-06-27</w:t>
+        <w:t>Date: 2026-07-03</w:t>
       </w:r>
     </w:p>
     <w:p>

</xml_diff>